<commit_message>
docs(demo): refresh study guide references for commented scripts
</commit_message>
<xml_diff>
--- a/Working Files/Interactive Prototype 2/Code Study/Code Study Guide.docx
+++ b/Working Files/Interactive Prototype 2/Code Study/Code Study Guide.docx
@@ -281,6 +281,44 @@
           <w:sz w:val="24"/>
         </w:rPr>
         <w:t>Be ready to show the source rather than only describing the APK. An APK is the compiled Android application. The readable C# scripts, Unity scene, package manifest, and project settings are the source material. The assessor may ask you to open a relevant script or explain how a controller action produces a result.</w:t>
+      </w:r>
+    </w:p>
+    <w:p>
+      <w:pPr>
+        <w:keepNext/>
+        <w:pageBreakBefore w:val="0"/>
+        <w:spacing w:line="480" w:lineRule="auto"/>
+        <w:ind w:firstLine="0"/>
+        <w:jc w:val="left"/>
+      </w:pPr>
+      <w:r>
+        <w:rPr>
+          <w:rFonts w:ascii="Times New Roman" w:hAnsi="Times New Roman"/>
+          <w:b/>
+          <w:i w:val="0"/>
+          <w:color w:val="000000"/>
+          <w:sz w:val="24"/>
+        </w:rPr>
+        <w:t>Reading the Commented Scripts</w:t>
+      </w:r>
+    </w:p>
+    <w:p>
+      <w:pPr>
+        <w:keepNext w:val="0"/>
+        <w:pageBreakBefore w:val="0"/>
+        <w:spacing w:line="480" w:lineRule="auto"/>
+        <w:ind w:firstLine="720"/>
+        <w:jc w:val="left"/>
+      </w:pPr>
+      <w:r>
+        <w:rPr>
+          <w:rFonts w:ascii="Times New Roman" w:hAnsi="Times New Roman"/>
+          <w:b w:val="0"/>
+          <w:i w:val="0"/>
+          <w:color w:val="000000"/>
+          <w:sz w:val="24"/>
+        </w:rPr>
+        <w:t>Every nonblank code line in the 27 custom runtime scripts has a lowercase explanation directly above it. Each file begins with a script overview and searchable feature words. Use Command-F for colour, teleportation, paper writing, recording, or method:. The executable code is unchanged. The line numbers below refer to the commented source.</w:t>
       </w:r>
     </w:p>
     <w:p>
@@ -2347,7 +2385,7 @@
                 <w:color w:val="000000"/>
                 <w:sz w:val="20"/>
               </w:rPr>
-              <w:t>Holds CurrentTool and CurrentColour in one place. SetTool at line 54 and SetColour at line 64 end the previous stroke before changing state. RequestClear at line 95, ConfirmClear at line 108, and CancelClear coordinate clearing. EnsureRecorder creates/configures the recorder during play. StateChanged tells displays and recording listeners to refresh. A shared manager prevents the button label and brush from using conflicting colour or tool values.</w:t>
+              <w:t>Holds CurrentTool and CurrentColour in one place. SetTool at line 112 and SetColour at line 133 end the previous stroke before changing state. RequestClear at line 197, ConfirmClear at line 222, and CancelClear coordinate clearing. EnsureRecorder creates/configures the recorder during play. StateChanged tells displays and recording listeners to refresh. A shared manager prevents the button label and brush from using conflicting colour or tool values.</w:t>
             </w:r>
           </w:p>
         </w:tc>
@@ -2394,7 +2432,7 @@
                 <w:color w:val="000000"/>
                 <w:sz w:val="20"/>
               </w:rPr>
-              <w:t>Adapts the imported classroom to the interactive systems at startup. Start at line 31 fits the room, places the functional board, and creates student stationery. FindTabletopBounds locates usable desk surfaces. CreateStationerySet at line 457 attaches PaperNoteCanvas, StudyTableToolMenu, and StudyTableTeleportPoint. ConfigurePaperForWriting at line 486 removes paper grabbing. This keeps imported visual geometry separate from the project-owned interactions.</w:t>
+              <w:t>Adapts the imported classroom to the interactive systems at startup. Start at line 70 fits the room, places the functional board, and creates student stationery. FindTabletopBounds locates usable desk surfaces. CreateStationerySet at line 964 attaches PaperNoteCanvas, StudyTableToolMenu, and StudyTableTeleportPoint. ConfigurePaperForWriting at line 1020 removes paper grabbing. This keeps imported visual geometry separate from the project-owned interactions.</w:t>
             </w:r>
           </w:p>
         </w:tc>
@@ -2533,7 +2571,7 @@
                 <w:color w:val="000000"/>
                 <w:sz w:val="20"/>
               </w:rPr>
-              <w:t>Owns the board's Texture2D, Color32 pixel array, runtime material, brush sizes, and stroke filtering. InitializeSurface at line 99 creates the surface. TryGetUV at line 143 converts a valid front-face hit into texture coordinates. BeginStroke at line 200, ContinueStroke at line 218, and EndStroke at line 284 define a stroke. Stamp and StampSegment paint pixels. ClearBoard fills white. DrawingEvent lets the recorder observe changes without putting recording logic into every input script.</w:t>
+              <w:t>Owns the board's Texture2D, Color32 pixel array, runtime material, brush sizes, and stroke filtering. InitializeSurface at line 238 creates the surface. TryGetUV at line 327 converts a valid front-face hit into texture coordinates. BeginStroke at line 455, ContinueStroke at line 492, and EndStroke at line 620 define a stroke. Stamp and StampSegment paint pixels. ClearBoard fills white. DrawingEvent lets the recorder observe changes without putting recording logic into every input script.</w:t>
             </w:r>
           </w:p>
         </w:tc>
@@ -2580,7 +2618,7 @@
                 <w:color w:val="000000"/>
                 <w:sz w:val="20"/>
               </w:rPr>
-              <w:t>A small bridge between input and the board canvas. DrawAtUV at line 26 begins a new stroke or continues an open one. EndStroke at line 53 ends it. It blocks live drawing while playback or clear confirmation is active. Controllers and the optional hand path can call the same entry point instead of duplicating stroke rules.</w:t>
+              <w:t>A small bridge between input and the board canvas. DrawAtUV at line 61 begins a new stroke or continues an open one. EndStroke at line 115 ends it. It blocks live drawing while playback or clear confirmation is active. Controllers and the optional hand path can call the same entry point instead of duplicating stroke rules.</w:t>
             </w:r>
           </w:p>
         </w:tc>
@@ -2627,7 +2665,7 @@
                 <w:color w:val="000000"/>
                 <w:sz w:val="20"/>
               </w:rPr>
-              <w:t>Owns an individual paper texture and a fine dark pencil brush. DrawAtUV at line 150 draws or erases. TryGetNearest at line 298 chooses the closest valid paper. TryGetPaperIntersection at line 328 uses the paper's top plane. ClearNote at line 289 clears only this instance. Each paper has its own pixels, so clearing one desk does not erase every desk or the whiteboard.</w:t>
+              <w:t>Owns an individual paper texture and a fine dark pencil brush. DrawAtUV at line 345 draws or erases. TryGetNearest at line 648 chooses the closest valid paper. TryGetPaperIntersection at line 706 uses the paper's top plane. ClearNote at line 626 clears only this instance. Each paper has its own pixels, so clearing one desk does not erase every desk or the whiteboard.</w:t>
             </w:r>
           </w:p>
         </w:tc>
@@ -2674,7 +2712,7 @@
                 <w:color w:val="000000"/>
                 <w:sz w:val="20"/>
               </w:rPr>
-              <w:t>Defines PaperToolKind and keeps the shared paper tool selection. Select at line 48 changes Pencil or Eraser and raises SelectionChanged. Compatibility handlers can observe held tools, but current generated paper is fixed and tools are selected through the menu. Selected paper tool is shared across desks while each paper's ink remains separate. This prevents paper tool state from overwriting the main whiteboard's marker/eraser state.</w:t>
+              <w:t>Defines PaperToolKind and keeps the shared paper tool selection. Select at line 96 changes Pencil or Eraser and raises SelectionChanged. Compatibility handlers can observe held tools, but current generated paper is fixed and tools are selected through the menu. Selected paper tool is shared across desks while each paper's ink remains separate. This prevents paper tool state from overwriting the main whiteboard's marker/eraser state.</w:t>
             </w:r>
           </w:p>
         </w:tc>
@@ -2813,7 +2851,7 @@
                 <w:color w:val="000000"/>
                 <w:sz w:val="20"/>
               </w:rPr>
-              <w:t>The main physical-controller input router. ResolveControllerTriggerAction at line 113 reads the XRI Select action, with a device-trigger fallback in TryGetControllerInput at line 866. LateUpdate at line 158 checks UI before paper and board drawing. RestrictToolUiToRightController at line 77 disables left-controller tool UI participation without removing its locomotion. Keeping input here lets the canvas receive device-independent UV points. The file also contains desktop pointer compatibility, so it is larger than the brush bridge.</w:t>
+              <w:t>The main physical-controller input router. ResolveControllerTriggerAction at line 256 reads the XRI Select action, with a device-trigger fallback in TryGetControllerInput at line 1726. LateUpdate at line 340 checks UI before paper and board drawing. RestrictToolUiToRightController at line 176 disables left-controller tool UI participation without removing its locomotion. Keeping input here lets the canvas receive device-independent UV points. The file also contains desktop pointer compatibility, so it is larger than the brush bridge.</w:t>
             </w:r>
           </w:p>
         </w:tc>
@@ -2860,7 +2898,7 @@
                 <w:color w:val="000000"/>
                 <w:sz w:val="20"/>
               </w:rPr>
-              <w:t>Handles movement, snap turning, fixed destinations, and desktop navigation. HandleXRInput at line 515 reads physical sticks. HandleQuestNavigationButtons at line 543 detects new X/Y presses. NavigateToWhiteboard at line 416 calculates a suitable board-facing destination. NavigateToNextTable at line 559 cycles table indices. AlignCameraToPose at line 480 moves the whole XR Origin around the actual tracked head. This keeps camera and controllers under one moving parent.</w:t>
+              <w:t>Handles movement, snap turning, fixed destinations, and desktop navigation. HandleXRInput at line 1064 reads physical sticks. HandleQuestNavigationButtons at line 1128 detects new X/Y presses. NavigateToWhiteboard at line 855 calculates a suitable board-facing destination. NavigateToNextTable at line 1158 cycles table indices. AlignCameraToPose at line 990 moves the whole XR Origin around the actual tracked head. This keeps camera and controllers under one moving parent.</w:t>
             </w:r>
           </w:p>
         </w:tc>
@@ -2907,7 +2945,7 @@
                 <w:color w:val="000000"/>
                 <w:sz w:val="20"/>
               </w:rPr>
-              <w:t>Represents an intended camera/head position and a horizontal facing direction. FindOrCreate at line 14 stores anchors under NavigationAnchors. It provides destination data rather than moving the player itself. Separating the target from the movement code lets several tables use the same navigation algorithm.</w:t>
+              <w:t>Represents an intended camera/head position and a horizontal facing direction. FindOrCreate at line 32 stores anchors under NavigationAnchors. It provides destination data rather than moving the player itself. Separating the target from the movement code lets several tables use the same navigation algorithm.</w:t>
             </w:r>
           </w:p>
         </w:tc>
@@ -2954,7 +2992,7 @@
                 <w:color w:val="000000"/>
                 <w:sz w:val="20"/>
               </w:rPr>
-              <w:t>Connects one paper and desk to its SeatAnchor. Initialize at line 32 derives eye position from desk bounds and registers a table index. OnEnable and OnDisable keep the active table list current. It knows where the desk is, while locomotion decides when and how to move the rig there.</w:t>
+              <w:t>Connects one paper and desk to its SeatAnchor. Initialize at line 82 derives eye position from desk bounds and registers a table index. OnEnable and OnDisable keep the active table list current. It knows where the desk is, while locomotion decides when and how to move the rig there.</w:t>
             </w:r>
           </w:p>
         </w:tc>
@@ -3001,7 +3039,7 @@
                 <w:color w:val="000000"/>
                 <w:sz w:val="20"/>
               </w:rPr>
-              <w:t>Restricts which keyboard and mouse actions the simulator owns. SetExplicitControllerMode at line 60 changes controller posing mode. GatedMouse and Dispose create gated actions and restore the previous references. This prevents ordinary room movement from also moving simulated hands and makes the faster-controller symptom easier to isolate. It supports editor testing and is not the Quest hardware tracking implementation.</w:t>
+              <w:t>Restricts which keyboard and mouse actions the simulator owns. SetExplicitControllerMode at line 141 changes controller posing mode. GatedMouse and Dispose create gated actions and restore the previous references. This prevents ordinary room movement from also moving simulated hands and makes the faster-controller symptom easier to isolate. It supports editor testing and is not the Quest hardware tracking implementation.</w:t>
             </w:r>
           </w:p>
         </w:tc>
@@ -3048,7 +3086,7 @@
                 <w:color w:val="000000"/>
                 <w:sz w:val="20"/>
               </w:rPr>
-              <w:t>PulseRightController at line 7 requests a small right-controller haptic impulse. Shared feedback code avoids repeating device lookup and pulse settings across colour, tool, and recording buttons. A haptic request in code is not proof that every device produced feedback during testing.</w:t>
+              <w:t>PulseRightController at line 23 requests a small right-controller haptic impulse. Shared feedback code avoids repeating device lookup and pulse settings across colour, tool, and recording buttons. A haptic request in code is not proof that every device produced feedback during testing.</w:t>
             </w:r>
           </w:p>
         </w:tc>
@@ -3187,7 +3225,7 @@
                 <w:color w:val="000000"/>
                 <w:sz w:val="20"/>
               </w:rPr>
-              <w:t>Binds one button to one WhiteboardColour. SelectColour at line 42 asks the manager to change it. Refresh at line 48 updates the swatch and selection outline. The button chooses a value rather than painting the board itself.</w:t>
+              <w:t>Binds one button to one WhiteboardColour. SelectColour at line 93 asks the manager to change it. Refresh at line 106 updates the swatch and selection outline. The button chooses a value rather than painting the board itself.</w:t>
             </w:r>
           </w:p>
         </w:tc>
@@ -3234,7 +3272,7 @@
                 <w:color w:val="000000"/>
                 <w:sz w:val="20"/>
               </w:rPr>
-              <w:t>Binds Marker or Eraser to the manager. SelectTool at line 40 requests the change and Refresh updates its active outline. It shares the same state source as colour controls and the canvas.</w:t>
+              <w:t>Binds Marker or Eraser to the manager. SelectTool at line 89 requests the change and Refresh updates its active outline. It shares the same state source as colour controls and the canvas.</w:t>
             </w:r>
           </w:p>
         </w:tc>
@@ -3281,7 +3319,7 @@
                 <w:color w:val="000000"/>
                 <w:sz w:val="20"/>
               </w:rPr>
-              <w:t>RequestClear at line 24 asks the manager to open confirmation. It deliberately does not directly wipe the canvas, so an accidental first click can be cancelled.</w:t>
+              <w:t>RequestClear at line 57 asks the manager to open confirmation. It deliberately does not directly wipe the canvas, so an accidental first click can be cancelled.</w:t>
             </w:r>
           </w:p>
         </w:tc>
@@ -3328,7 +3366,7 @@
                 <w:color w:val="000000"/>
                 <w:sz w:val="20"/>
               </w:rPr>
-              <w:t>Show, Hide, Confirm, and Cancel control the clear overlay. BindListeners at line 29 avoids binding the same button twice. The confirmation layout is separate from the board's pixel-clearing operation.</w:t>
+              <w:t>Show, Hide, Confirm, and Cancel control the clear overlay. BindListeners at line 72 avoids binding the same button twice. The confirmation layout is separate from the board's pixel-clearing operation.</w:t>
             </w:r>
           </w:p>
         </w:tc>
@@ -3375,7 +3413,7 @@
                 <w:color w:val="000000"/>
                 <w:sz w:val="20"/>
               </w:rPr>
-              <w:t>Refresh at line 30 shows the active tool and colour. InitializeCompact supports the later compact panel. SetDrawingState changes activity feedback. Display code observes state and should not become a second state manager.</w:t>
+              <w:t>Refresh at line 71 shows the active tool and colour. InitializeCompact supports the later compact panel. SetDrawingState changes activity feedback. Display code observes state and should not become a second state manager.</w:t>
             </w:r>
           </w:p>
         </w:tc>
@@ -3422,7 +3460,7 @@
                 <w:color w:val="000000"/>
                 <w:sz w:val="20"/>
               </w:rPr>
-              <w:t>Initialize at line 22 rearranges and styles the board controls and adds recording controls. RecordOrStop at line 123 calls the recorder. RefreshSession at line 138 updates labels, timing, and button availability. RefreshSelection marks active choices. During playback it disables drawing controls so the replay is not changed by live selection. The actual replay algorithm remains in the recorder.</w:t>
+              <w:t>Initialize at line 54 rearranges and styles the board controls and adds recording controls. RecordOrStop at line 316 calls the recorder. RefreshSession at line 347 updates labels, timing, and button availability. RefreshSelection marks active choices. During playback it disables drawing controls so the replay is not changed by live selection. The actual replay algorithm remains in the recorder.</w:t>
             </w:r>
           </w:p>
         </w:tc>
@@ -3469,7 +3507,7 @@
                 <w:color w:val="000000"/>
                 <w:sz w:val="20"/>
               </w:rPr>
-              <w:t>Builds the menu beside a paper. BuildMenu at line 118 creates Pencil, Eraser, and Clear Paper. LateUpdate at line 156 shows the closest occupied desk menu instead of cluttering every desk. SelectTool at line 248 updates PaperTool. ClearPaper at line 254 clears its linked note. Pointer handling avoids repeated clicks and consumes menu hits before they become ink.</w:t>
+              <w:t>Builds the menu beside a paper. BuildMenu at line 253 creates Pencil, Eraser, and Clear Paper. LateUpdate at line 354 shows the closest occupied desk menu instead of cluttering every desk. SelectTool at line 543 updates PaperTool. ClearPaper at line 555 clears its linked note. Pointer handling avoids repeated clicks and consumes menu hits before they become ink.</w:t>
             </w:r>
           </w:p>
         </w:tc>
@@ -3516,7 +3554,7 @@
                 <w:color w:val="000000"/>
                 <w:sz w:val="20"/>
               </w:rPr>
-              <w:t>Build at line 36 creates a view-relative world-space guide explaining the two controller roles. Update at line 103 toggles it on a new right-A press. ShowGuide at line 123 changes visibility. The default initial display is 14 seconds and it can be reopened. Guidance is separated from movement so changing instructions does not change navigation behaviour.</w:t>
+              <w:t>Build at line 87 creates a view-relative world-space guide explaining the two controller roles. Update at line 248 toggles it on a new right-A press. ShowGuide at line 291 changes visibility. The default initial display is 14 seconds and it can be reopened. Guidance is separated from movement so changing instructions does not change navigation behaviour.</w:t>
             </w:r>
           </w:p>
         </w:tc>
@@ -3563,7 +3601,7 @@
                 <w:color w:val="000000"/>
                 <w:sz w:val="20"/>
               </w:rPr>
-              <w:t>Awake at line 17 connects XRI UI actions to XRUIInputModule. Initialize supplies the action asset and module. XR input is enabled, and automatic mouse input is disabled because the custom desktop bridge already handles that pointer. This avoids delivering one desktop click twice.</w:t>
+              <w:t>Awake at line 38 connects XRI UI actions to XRUIInputModule. Initialize supplies the action asset and module. XR input is enabled, and automatic mouse input is disabled because the custom desktop bridge already handles that pointer. This avoids delivering one desktop click twice.</w:t>
             </w:r>
           </w:p>
         </w:tc>
@@ -3610,7 +3648,7 @@
                 <w:color w:val="000000"/>
                 <w:sz w:val="20"/>
               </w:rPr>
-              <w:t>Shared creation and styling helpers for panels, buttons, and text. CreateButton at line 60 and StyleButton at line 71 provide consistent active/hover appearance. RoundedSprite produces the common shape. It keeps layout/appearance details out of each feature's state logic.</w:t>
+              <w:t>Shared creation and styling helpers for panels, buttons, and text. CreateButton at line 129 and StyleButton at line 152 provide consistent active/hover appearance. RoundedSprite produces the common shape. It keeps layout/appearance details out of each feature's state logic.</w:t>
             </w:r>
           </w:p>
         </w:tc>
@@ -3657,7 +3695,7 @@
                 <w:color w:val="000000"/>
                 <w:sz w:val="20"/>
               </w:rPr>
-              <w:t>Draws Record, Stop, and Play shapes through OnPopulateMesh at line 19. SetKind changes the symbol. Using a small mesh avoids depending on an external icon font and keeps icon generation independent of recording state.</w:t>
+              <w:t>Draws Record, Stop, and Play shapes through OnPopulateMesh at line 46. SetKind changes the symbol. Using a small mesh avoids depending on an external icon font and keeps icon generation independent of recording state.</w:t>
             </w:r>
           </w:p>
         </w:tc>
@@ -3843,7 +3881,7 @@
                 <w:color w:val="000000"/>
                 <w:sz w:val="20"/>
               </w:rPr>
-              <w:t>Configure at line 35 subscribes to board and manager events. StartRecording at line 48 captures starting pixels and starts the clock. Stop at line 73 closes the last stroke. Play at line 97 restores the start and ApplyEventsThrough at line 125 replays events at their recorded times. Separating data, recorder, UI, and canvas makes playback testable without recording camera frames. The session is memory-only and currently covers the whiteboard, not paper or microphone audio.</w:t>
+              <w:t>Configure at line 84 subscribes to board and manager events. StartRecording at line 114 captures starting pixels and starts the clock. Stop at line 164 closes the last stroke. Play at line 211 restores the start and ApplyEventsThrough at line 270 replays events at their recorded times. Separating data, recorder, UI, and canvas makes playback testable without recording camera frames. The session is memory-only and currently covers the whiteboard, not paper or microphone audio.</w:t>
             </w:r>
           </w:p>
         </w:tc>
@@ -3890,7 +3928,7 @@
                 <w:color w:val="000000"/>
                 <w:sz w:val="20"/>
               </w:rPr>
-              <w:t>Reads right index/thumb joint poses and uses separate start/release pinch distances. Update at line 36 sends successful board hits to the same WhiteboardDrawer. It ends strokes when tracking or contact is lost and skips the editor to prevent a second input writer. This is a secondary path, not evidence that physical hand tracking was tested in the controller study.</w:t>
+              <w:t>Reads right index/thumb joint poses and uses separate start/release pinch distances. Update at line 79 sends successful board hits to the same WhiteboardDrawer. It ends strokes when tracking or contact is lost and skips the editor to prevent a second input writer. This is a secondary path, not evidence that physical hand tracking was tested in the controller study.</w:t>
             </w:r>
           </w:p>
         </w:tc>
@@ -5291,7 +5329,7 @@
           <w:color w:val="000000"/>
           <w:sz w:val="24"/>
         </w:rPr>
-        <w:t>The intended control guide describes right-trigger writing, but an action name alone does not establish its physical binding. The saved scene references the XRI Default Input Actions asset. In that asset, the controller Select binding uses GripButton, while Activate uses TriggerButton. XRWhiteboardInteractor.ResolveControllerTriggerAction currently requests XRI Right Interaction/Select. Its direct device trigger fallback is reached only if no action was resolved. The code comment describing Select as the index trigger does not match the saved bindings.</w:t>
+        <w:t>The intended control guide describes right-trigger writing, but an action name alone does not establish its physical binding. The saved scene references the XRI Default Input Actions asset. In that asset, the controller Select binding uses GripButton, while Activate uses TriggerButton. XRWhiteboardInteractor.ResolveControllerTriggerAction currently requests XRI Right Interaction/Select. Its direct device trigger fallback is reached only if no action was resolved. The script comments now describe this binding distinction beside the action lookup.</w:t>
       </w:r>
     </w:p>
     <w:tbl>
@@ -5571,7 +5609,7 @@
           <w:color w:val="000000"/>
           <w:sz w:val="24"/>
         </w:rPr>
-        <w:t>For a code explanation, show both the action lookup and its actual binding rather than treating Select and trigger as synonyms. A runtime override or different build-time asset would need evidence. No runtime code, bindings, or APK were changed for this study guide. Confirm the mapping before making a future build rather than assuming the explanatory comment is authoritative.</w:t>
+        <w:t>For a code explanation, show both the action lookup and its actual binding rather than treating Select and trigger as synonyms. A runtime override or different build-time asset would need evidence. No runtime code, bindings, or APK were changed for this study guide. Confirm the mapping before making a future build by inspecting the binding rather than inferring it from an action name.</w:t>
       </w:r>
     </w:p>
     <w:p>

</xml_diff>